<commit_message>
docs: checkpoint enterprise platform architecture
</commit_message>
<xml_diff>
--- a/docs/介绍/管理软件基本需求.docx
+++ b/docs/介绍/管理软件基本需求.docx
@@ -4,33 +4,82 @@
   <w:body>
     <w:p>
       <w:pPr>
-        <w:rPr>
-          <w:rFonts w:ascii="Arial Unicode MS" w:eastAsia="Arial Unicode MS" w:hAnsi="Arial Unicode MS" w:cs="Arial Unicode MS"/>
-          <w:color w:val="202830"/>
-          <w:sz w:val="22"/>
-        </w:rPr>
-      </w:pPr>
-      <w:r>
-        <w:rPr>
-          <w:rFonts w:ascii="宋体" w:eastAsia="宋体" w:hAnsi="宋体" w:cs="宋体" w:hint="eastAsia"/>
-          <w:color w:val="202830"/>
-          <w:sz w:val="22"/>
+        <w:keepNext/>
+        <w:spacing w:after="80"/>
+        <w:jc w:val="left"/>
+        <w:shd w:fill="FFF4CE" w:val="clear"/>
+      </w:pPr>
+      <w:r>
+        <w:rPr>
+          <w:rFonts w:ascii="Arial" w:hAnsi="Arial" w:eastAsia="Microsoft YaHei" w:cs="Arial"/>
+          <w:b/>
+          <w:color w:val="1F4E78"/>
+          <w:sz w:val="28"/>
+          <w:lang w:val="en-US" w:eastAsia="zh-CN" w:bidi="ar-SA"/>
+        </w:rPr>
+        <w:t>文档状态：客户原始业务需求基线（F-57 追踪来源）</w:t>
+      </w:r>
+    </w:p>
+    <w:p>
+      <w:pPr>
+        <w:spacing w:after="80" w:line="288" w:lineRule="auto"/>
+      </w:pPr>
+      <w:r>
+        <w:rPr>
+          <w:rFonts w:ascii="Arial" w:hAnsi="Arial" w:eastAsia="Microsoft YaHei" w:cs="Arial"/>
+          <w:b w:val="0"/>
+          <w:sz w:val="21"/>
+          <w:lang w:val="en-US" w:eastAsia="zh-CN" w:bidi="ar-SA"/>
+        </w:rPr>
+        <w:t>本文件原样保留客户业务需求，是 F-57 需求追踪的正式来源之一；下方原文不直接定义技术架构、首发范围或安全实现。现行范围、接口、数据、权限、安全、测试与部署口径，以仓库 README 指向的 F-57 总体设计、需求追踪、权威登记和实施计划为准。</w:t>
+      </w:r>
+    </w:p>
+    <w:p>
+      <w:pPr>
+        <w:spacing w:after="200" w:line="288" w:lineRule="auto"/>
+      </w:pPr>
+      <w:r>
+        <w:rPr>
+          <w:rFonts w:ascii="Arial" w:hAnsi="Arial" w:eastAsia="Microsoft YaHei" w:cs="Arial"/>
+          <w:b/>
+          <w:sz w:val="21"/>
+          <w:lang w:val="en-US" w:eastAsia="zh-CN" w:bidi="ar-SA"/>
+        </w:rPr>
+        <w:t>解释规则：下方“销售、采购、财务、技术、管理者”是默认人物与工作台模板，不是写死岗位；权限由主体、能力、数据范围、条件、期限、设备、金额和状态动态决定。“生产触发采购”作为外部生产需求接口保留，完整 MRP/MES 延期；本地模型实现延期，MCP 与服务器控制中心按 F-57 的受控能力和权威边界实现。</w:t>
+      </w:r>
+    </w:p>
+    <w:p>
+      <w:pPr>
+        <w:rPr>
+          <w:rFonts w:ascii="Arial" w:eastAsia="Microsoft YaHei" w:hAnsi="Arial" w:cs="Arial"/>
+          <w:color w:val="202830"/>
+          <w:sz w:val="22"/>
+        </w:rPr>
+      </w:pPr>
+      <w:r>
+        <w:rPr>
+          <w:rFonts w:ascii="Arial" w:eastAsia="Microsoft YaHei" w:hAnsi="Arial" w:cs="Arial"/>
+          <w:color w:val="202830"/>
+          <w:sz w:val="22"/>
+          <w:lang w:val="en-US" w:eastAsia="zh-CN" w:bidi="ar-SA"/>
         </w:rPr>
         <w:t>使用人员：销售，采购，财务，</w:t>
       </w:r>
       <w:r>
         <w:rPr>
-          <w:rFonts w:ascii="宋体" w:eastAsia="宋体" w:hAnsi="宋体" w:cs="宋体" w:hint="eastAsia"/>
-          <w:color w:val="202830"/>
-          <w:sz w:val="22"/>
+          <w:rFonts w:ascii="Arial" w:eastAsia="Microsoft YaHei" w:hAnsi="Arial" w:cs="Arial"/>
+          <w:color w:val="202830"/>
+          <w:sz w:val="22"/>
+          <w:lang w:val="en-US" w:eastAsia="zh-CN" w:bidi="ar-SA"/>
         </w:rPr>
         <w:t>技术、</w:t>
       </w:r>
       <w:r>
         <w:rPr>
-          <w:rFonts w:ascii="宋体" w:eastAsia="宋体" w:hAnsi="宋体" w:cs="宋体" w:hint="eastAsia"/>
-          <w:color w:val="202830"/>
-          <w:sz w:val="22"/>
+          <w:rFonts w:ascii="Arial" w:eastAsia="Microsoft YaHei" w:hAnsi="Arial" w:cs="Arial"/>
+          <w:color w:val="202830"/>
+          <w:sz w:val="22"/>
+          <w:lang w:val="en-US" w:eastAsia="zh-CN" w:bidi="ar-SA"/>
         </w:rPr>
         <w:t>管理者</w:t>
       </w:r>
@@ -38,24 +87,26 @@
     <w:p>
       <w:pPr>
         <w:rPr>
-          <w:rFonts w:ascii="Arial Unicode MS" w:eastAsia="Arial Unicode MS" w:hAnsi="Arial Unicode MS" w:cs="Arial Unicode MS" w:hint="eastAsia"/>
-          <w:color w:val="202830"/>
-          <w:sz w:val="22"/>
-        </w:rPr>
-      </w:pPr>
-      <w:r>
-        <w:rPr>
-          <w:rFonts w:ascii="宋体" w:eastAsia="宋体" w:hAnsi="宋体" w:cs="宋体" w:hint="eastAsia"/>
-          <w:color w:val="202830"/>
-          <w:sz w:val="22"/>
+          <w:rFonts w:ascii="Arial" w:eastAsia="Microsoft YaHei" w:hAnsi="Arial" w:cs="Arial"/>
+          <w:color w:val="202830"/>
+          <w:sz w:val="22"/>
+        </w:rPr>
+      </w:pPr>
+      <w:r>
+        <w:rPr>
+          <w:rFonts w:ascii="Arial" w:eastAsia="Microsoft YaHei" w:hAnsi="Arial" w:cs="Arial"/>
+          <w:color w:val="202830"/>
+          <w:sz w:val="22"/>
+          <w:lang w:val="en-US" w:eastAsia="zh-CN" w:bidi="ar-SA"/>
         </w:rPr>
         <w:t>根据每个角色进行权限分配</w:t>
       </w:r>
       <w:r>
         <w:rPr>
-          <w:rFonts w:ascii="宋体" w:eastAsia="宋体" w:hAnsi="宋体" w:cs="宋体" w:hint="eastAsia"/>
-          <w:color w:val="202830"/>
-          <w:sz w:val="22"/>
+          <w:rFonts w:ascii="Arial" w:eastAsia="Microsoft YaHei" w:hAnsi="Arial" w:cs="Arial"/>
+          <w:color w:val="202830"/>
+          <w:sz w:val="22"/>
+          <w:lang w:val="en-US" w:eastAsia="zh-CN" w:bidi="ar-SA"/>
         </w:rPr>
         <w:t>（针对功能模块、表单、字段）</w:t>
       </w:r>
@@ -63,25 +114,29 @@
     <w:p>
       <w:pPr>
         <w:rPr>
-          <w:rFonts w:ascii="Arial Unicode MS" w:eastAsia="Arial Unicode MS" w:hAnsi="Arial Unicode MS" w:cs="Arial Unicode MS"/>
-          <w:color w:val="202830"/>
-          <w:sz w:val="22"/>
-        </w:rPr>
-      </w:pPr>
-    </w:p>
-    <w:p>
-      <w:pPr>
-        <w:rPr>
-          <w:rFonts w:ascii="Arial Unicode MS" w:eastAsia="Arial Unicode MS" w:hAnsi="Arial Unicode MS" w:cs="Arial Unicode MS"/>
-          <w:color w:val="202830"/>
-          <w:sz w:val="22"/>
-        </w:rPr>
-      </w:pPr>
-      <w:r>
-        <w:rPr>
-          <w:rFonts w:ascii="宋体" w:eastAsia="宋体" w:hAnsi="宋体" w:cs="宋体" w:hint="eastAsia"/>
-          <w:color w:val="202830"/>
-          <w:sz w:val="22"/>
+          <w:rFonts w:ascii="Arial" w:eastAsia="Microsoft YaHei" w:hAnsi="Arial" w:cs="Arial"/>
+          <w:color w:val="202830"/>
+          <w:sz w:val="22"/>
+        </w:rPr>
+      </w:pPr>
+    </w:p>
+    <w:p>
+      <w:pPr>
+        <w:pStyle w:val="1"/>
+        <w:keepNext/>
+        <w:keepLines/>
+        <w:rPr>
+          <w:rFonts w:ascii="Arial" w:eastAsia="Microsoft YaHei" w:hAnsi="Arial" w:cs="Arial"/>
+          <w:color w:val="202830"/>
+          <w:sz w:val="22"/>
+        </w:rPr>
+      </w:pPr>
+      <w:r>
+        <w:rPr>
+          <w:rFonts w:ascii="Arial" w:eastAsia="Microsoft YaHei" w:hAnsi="Arial" w:cs="Arial"/>
+          <w:color w:val="202830"/>
+          <w:sz w:val="22"/>
+          <w:lang w:val="en-US" w:eastAsia="zh-CN" w:bidi="ar-SA"/>
         </w:rPr>
         <w:t>销售</w:t>
       </w:r>
@@ -89,32 +144,35 @@
     <w:p>
       <w:pPr>
         <w:rPr>
-          <w:rFonts w:ascii="Arial Unicode MS" w:eastAsia="Arial Unicode MS" w:hAnsi="Arial Unicode MS" w:cs="Arial Unicode MS"/>
-          <w:color w:val="202830"/>
-          <w:sz w:val="22"/>
-        </w:rPr>
-      </w:pPr>
-      <w:r>
-        <w:rPr>
-          <w:rFonts w:ascii="宋体" w:eastAsia="宋体" w:hAnsi="宋体" w:cs="宋体" w:hint="eastAsia"/>
-          <w:color w:val="202830"/>
-          <w:sz w:val="22"/>
+          <w:rFonts w:ascii="Arial" w:eastAsia="Microsoft YaHei" w:hAnsi="Arial" w:cs="Arial"/>
+          <w:color w:val="202830"/>
+          <w:sz w:val="22"/>
+        </w:rPr>
+      </w:pPr>
+      <w:r>
+        <w:rPr>
+          <w:rFonts w:ascii="Arial" w:eastAsia="Microsoft YaHei" w:hAnsi="Arial" w:cs="Arial"/>
+          <w:color w:val="202830"/>
+          <w:sz w:val="22"/>
+          <w:lang w:val="en-US" w:eastAsia="zh-CN" w:bidi="ar-SA"/>
         </w:rPr>
         <w:t>销售建单</w:t>
       </w:r>
       <w:r>
         <w:rPr>
-          <w:rFonts w:ascii="宋体" w:eastAsia="宋体" w:hAnsi="宋体" w:cs="宋体" w:hint="eastAsia"/>
-          <w:color w:val="202830"/>
-          <w:sz w:val="22"/>
+          <w:rFonts w:ascii="Arial" w:eastAsia="Microsoft YaHei" w:hAnsi="Arial" w:cs="Arial"/>
+          <w:color w:val="202830"/>
+          <w:sz w:val="22"/>
+          <w:lang w:val="en-US" w:eastAsia="zh-CN" w:bidi="ar-SA"/>
         </w:rPr>
         <w:t>（录入合同）</w:t>
       </w:r>
       <w:r>
         <w:rPr>
-          <w:rFonts w:ascii="宋体" w:eastAsia="宋体" w:hAnsi="宋体" w:cs="宋体" w:hint="eastAsia"/>
-          <w:color w:val="202830"/>
-          <w:sz w:val="22"/>
+          <w:rFonts w:ascii="Arial" w:eastAsia="Microsoft YaHei" w:hAnsi="Arial" w:cs="Arial"/>
+          <w:color w:val="202830"/>
+          <w:sz w:val="22"/>
+          <w:lang w:val="en-US" w:eastAsia="zh-CN" w:bidi="ar-SA"/>
         </w:rPr>
         <w:t>：销售选择客户、产品、数量、价格和交期，系统自动带出已有资料。</w:t>
       </w:r>
@@ -122,16 +180,17 @@
     <w:p>
       <w:pPr>
         <w:rPr>
-          <w:rFonts w:ascii="Arial Unicode MS" w:eastAsia="Arial Unicode MS" w:hAnsi="Arial Unicode MS" w:cs="Arial Unicode MS"/>
-          <w:color w:val="202830"/>
-          <w:sz w:val="22"/>
-        </w:rPr>
-      </w:pPr>
-      <w:r>
-        <w:rPr>
-          <w:rFonts w:ascii="宋体" w:eastAsia="宋体" w:hAnsi="宋体" w:cs="宋体" w:hint="eastAsia"/>
-          <w:color w:val="202830"/>
-          <w:sz w:val="22"/>
+          <w:rFonts w:ascii="Arial" w:eastAsia="Microsoft YaHei" w:hAnsi="Arial" w:cs="Arial"/>
+          <w:color w:val="202830"/>
+          <w:sz w:val="22"/>
+        </w:rPr>
+      </w:pPr>
+      <w:r>
+        <w:rPr>
+          <w:rFonts w:ascii="Arial" w:eastAsia="Microsoft YaHei" w:hAnsi="Arial" w:cs="Arial"/>
+          <w:color w:val="202830"/>
+          <w:sz w:val="22"/>
+          <w:lang w:val="en-US" w:eastAsia="zh-CN" w:bidi="ar-SA"/>
         </w:rPr>
         <w:t>合同审批：关键条款、折扣、付款计划和附件进入对应审批，不能越权跳过。</w:t>
       </w:r>
@@ -139,48 +198,53 @@
     <w:p>
       <w:pPr>
         <w:rPr>
-          <w:rFonts w:ascii="Arial Unicode MS" w:eastAsia="Arial Unicode MS" w:hAnsi="Arial Unicode MS" w:cs="Arial Unicode MS"/>
-          <w:color w:val="202830"/>
-          <w:sz w:val="22"/>
-        </w:rPr>
-      </w:pPr>
-      <w:r>
-        <w:rPr>
-          <w:rFonts w:ascii="宋体" w:eastAsia="宋体" w:hAnsi="宋体" w:cs="宋体" w:hint="eastAsia"/>
-          <w:color w:val="202830"/>
-          <w:sz w:val="22"/>
+          <w:rFonts w:ascii="Arial" w:eastAsia="Microsoft YaHei" w:hAnsi="Arial" w:cs="Arial"/>
+          <w:color w:val="202830"/>
+          <w:sz w:val="22"/>
+        </w:rPr>
+      </w:pPr>
+      <w:r>
+        <w:rPr>
+          <w:rFonts w:ascii="Arial" w:eastAsia="Microsoft YaHei" w:hAnsi="Arial" w:cs="Arial"/>
+          <w:color w:val="202830"/>
+          <w:sz w:val="22"/>
+          <w:lang w:val="en-US" w:eastAsia="zh-CN" w:bidi="ar-SA"/>
         </w:rPr>
         <w:t>发票申请：申请日期，开票内容（</w:t>
       </w:r>
       <w:r>
         <w:rPr>
-          <w:rFonts w:ascii="宋体" w:eastAsia="宋体" w:hAnsi="宋体" w:cs="宋体" w:hint="eastAsia"/>
-          <w:color w:val="202830"/>
-          <w:sz w:val="22"/>
+          <w:rFonts w:ascii="Arial" w:eastAsia="Microsoft YaHei" w:hAnsi="Arial" w:cs="Arial"/>
+          <w:color w:val="202830"/>
+          <w:sz w:val="22"/>
+          <w:lang w:val="en-US" w:eastAsia="zh-CN" w:bidi="ar-SA"/>
         </w:rPr>
         <w:t>系统自动带出已有资料</w:t>
       </w:r>
       <w:r>
         <w:rPr>
-          <w:rFonts w:ascii="宋体" w:eastAsia="宋体" w:hAnsi="宋体" w:cs="宋体" w:hint="eastAsia"/>
-          <w:color w:val="202830"/>
-          <w:sz w:val="22"/>
+          <w:rFonts w:ascii="Arial" w:eastAsia="Microsoft YaHei" w:hAnsi="Arial" w:cs="Arial"/>
+          <w:color w:val="202830"/>
+          <w:sz w:val="22"/>
+          <w:lang w:val="en-US" w:eastAsia="zh-CN" w:bidi="ar-SA"/>
         </w:rPr>
         <w:t>，可修改），开票比例</w:t>
       </w:r>
       <w:r>
         <w:rPr>
-          <w:rFonts w:ascii="宋体" w:eastAsia="宋体" w:hAnsi="宋体" w:cs="宋体" w:hint="eastAsia"/>
-          <w:color w:val="202830"/>
-          <w:sz w:val="22"/>
+          <w:rFonts w:ascii="Arial" w:eastAsia="Microsoft YaHei" w:hAnsi="Arial" w:cs="Arial"/>
+          <w:color w:val="202830"/>
+          <w:sz w:val="22"/>
+          <w:lang w:val="en-US" w:eastAsia="zh-CN" w:bidi="ar-SA"/>
         </w:rPr>
         <w:t>、</w:t>
       </w:r>
       <w:r>
         <w:rPr>
-          <w:rFonts w:ascii="宋体" w:eastAsia="宋体" w:hAnsi="宋体" w:cs="宋体" w:hint="eastAsia"/>
-          <w:color w:val="202830"/>
-          <w:sz w:val="22"/>
+          <w:rFonts w:ascii="Arial" w:eastAsia="Microsoft YaHei" w:hAnsi="Arial" w:cs="Arial"/>
+          <w:color w:val="202830"/>
+          <w:sz w:val="22"/>
+          <w:lang w:val="en-US" w:eastAsia="zh-CN" w:bidi="ar-SA"/>
         </w:rPr>
         <w:t>金额，预计收款日期等</w:t>
       </w:r>
@@ -188,16 +252,17 @@
     <w:p>
       <w:pPr>
         <w:rPr>
-          <w:rFonts w:ascii="Arial Unicode MS" w:eastAsia="Arial Unicode MS" w:hAnsi="Arial Unicode MS" w:cs="Arial Unicode MS"/>
-          <w:color w:val="202830"/>
-          <w:sz w:val="22"/>
-        </w:rPr>
-      </w:pPr>
-      <w:r>
-        <w:rPr>
-          <w:rFonts w:ascii="Arial Unicode MS" w:eastAsia="Arial Unicode MS" w:hAnsi="Arial Unicode MS" w:cs="Arial Unicode MS"/>
-          <w:color w:val="202830"/>
-          <w:sz w:val="22"/>
+          <w:rFonts w:ascii="Arial" w:eastAsia="Microsoft YaHei" w:hAnsi="Arial" w:cs="Arial"/>
+          <w:color w:val="202830"/>
+          <w:sz w:val="22"/>
+        </w:rPr>
+      </w:pPr>
+      <w:r>
+        <w:rPr>
+          <w:rFonts w:ascii="Arial" w:eastAsia="Microsoft YaHei" w:hAnsi="Arial" w:cs="Arial"/>
+          <w:color w:val="202830"/>
+          <w:sz w:val="22"/>
+          <w:lang w:val="en-US" w:eastAsia="zh-CN" w:bidi="ar-SA"/>
         </w:rPr>
         <w:t>销售可查看客户的历史合同、回款、投诉、设备和服务记录</w:t>
       </w:r>
@@ -205,34 +270,38 @@
     <w:p>
       <w:pPr>
         <w:rPr>
-          <w:rFonts w:ascii="Arial Unicode MS" w:eastAsia="Arial Unicode MS" w:hAnsi="Arial Unicode MS" w:cs="Arial Unicode MS"/>
-          <w:color w:val="202830"/>
-          <w:sz w:val="22"/>
-        </w:rPr>
-      </w:pPr>
-    </w:p>
-    <w:p>
-      <w:pPr>
-        <w:rPr>
-          <w:rFonts w:ascii="Arial Unicode MS" w:eastAsia="Arial Unicode MS" w:hAnsi="Arial Unicode MS" w:cs="Arial Unicode MS"/>
-          <w:color w:val="202830"/>
-          <w:sz w:val="22"/>
-        </w:rPr>
-      </w:pPr>
-    </w:p>
-    <w:p>
-      <w:pPr>
-        <w:rPr>
-          <w:rFonts w:ascii="Arial Unicode MS" w:eastAsia="Arial Unicode MS" w:hAnsi="Arial Unicode MS" w:cs="Arial Unicode MS"/>
-          <w:color w:val="202830"/>
-          <w:sz w:val="22"/>
-        </w:rPr>
-      </w:pPr>
-      <w:r>
-        <w:rPr>
-          <w:rFonts w:ascii="宋体" w:eastAsia="宋体" w:hAnsi="宋体" w:cs="宋体" w:hint="eastAsia"/>
-          <w:color w:val="202830"/>
-          <w:sz w:val="22"/>
+          <w:rFonts w:ascii="Arial" w:eastAsia="Microsoft YaHei" w:hAnsi="Arial" w:cs="Arial"/>
+          <w:color w:val="202830"/>
+          <w:sz w:val="22"/>
+        </w:rPr>
+      </w:pPr>
+    </w:p>
+    <w:p>
+      <w:pPr>
+        <w:rPr>
+          <w:rFonts w:ascii="Arial" w:eastAsia="Microsoft YaHei" w:hAnsi="Arial" w:cs="Arial"/>
+          <w:color w:val="202830"/>
+          <w:sz w:val="22"/>
+        </w:rPr>
+      </w:pPr>
+    </w:p>
+    <w:p>
+      <w:pPr>
+        <w:pStyle w:val="1"/>
+        <w:keepNext/>
+        <w:keepLines/>
+        <w:rPr>
+          <w:rFonts w:ascii="Arial" w:eastAsia="Microsoft YaHei" w:hAnsi="Arial" w:cs="Arial"/>
+          <w:color w:val="202830"/>
+          <w:sz w:val="22"/>
+        </w:rPr>
+      </w:pPr>
+      <w:r>
+        <w:rPr>
+          <w:rFonts w:ascii="Arial" w:eastAsia="Microsoft YaHei" w:hAnsi="Arial" w:cs="Arial"/>
+          <w:color w:val="202830"/>
+          <w:sz w:val="22"/>
+          <w:lang w:val="en-US" w:eastAsia="zh-CN" w:bidi="ar-SA"/>
         </w:rPr>
         <w:t>采购：</w:t>
       </w:r>
@@ -240,16 +309,17 @@
     <w:p>
       <w:pPr>
         <w:rPr>
-          <w:rFonts w:ascii="Arial Unicode MS" w:eastAsia="Arial Unicode MS" w:hAnsi="Arial Unicode MS" w:cs="Arial Unicode MS"/>
-          <w:color w:val="202830"/>
-          <w:sz w:val="22"/>
-        </w:rPr>
-      </w:pPr>
-      <w:r>
-        <w:rPr>
-          <w:rFonts w:ascii="宋体" w:eastAsia="宋体" w:hAnsi="宋体" w:cs="宋体" w:hint="eastAsia"/>
-          <w:color w:val="202830"/>
-          <w:sz w:val="22"/>
+          <w:rFonts w:ascii="Arial" w:eastAsia="Microsoft YaHei" w:hAnsi="Arial" w:cs="Arial"/>
+          <w:color w:val="202830"/>
+          <w:sz w:val="22"/>
+        </w:rPr>
+      </w:pPr>
+      <w:r>
+        <w:rPr>
+          <w:rFonts w:ascii="Arial" w:eastAsia="Microsoft YaHei" w:hAnsi="Arial" w:cs="Arial"/>
+          <w:color w:val="202830"/>
+          <w:sz w:val="22"/>
+          <w:lang w:val="en-US" w:eastAsia="zh-CN" w:bidi="ar-SA"/>
         </w:rPr>
         <w:t>查看审批后的合同。</w:t>
       </w:r>
@@ -257,16 +327,17 @@
     <w:p>
       <w:pPr>
         <w:rPr>
-          <w:rFonts w:ascii="Arial Unicode MS" w:eastAsia="Arial Unicode MS" w:hAnsi="Arial Unicode MS" w:cs="Arial Unicode MS"/>
-          <w:color w:val="202830"/>
-          <w:sz w:val="22"/>
-        </w:rPr>
-      </w:pPr>
-      <w:r>
-        <w:rPr>
-          <w:rFonts w:ascii="宋体" w:eastAsia="宋体" w:hAnsi="宋体" w:cs="宋体" w:hint="eastAsia"/>
-          <w:color w:val="202830"/>
-          <w:sz w:val="22"/>
+          <w:rFonts w:ascii="Arial" w:eastAsia="Microsoft YaHei" w:hAnsi="Arial" w:cs="Arial"/>
+          <w:color w:val="202830"/>
+          <w:sz w:val="22"/>
+        </w:rPr>
+      </w:pPr>
+      <w:r>
+        <w:rPr>
+          <w:rFonts w:ascii="Arial" w:eastAsia="Microsoft YaHei" w:hAnsi="Arial" w:cs="Arial"/>
+          <w:color w:val="202830"/>
+          <w:sz w:val="22"/>
+          <w:lang w:val="en-US" w:eastAsia="zh-CN" w:bidi="ar-SA"/>
         </w:rPr>
         <w:t>根据合同订货，可分批订货；</w:t>
       </w:r>
@@ -274,16 +345,17 @@
     <w:p>
       <w:pPr>
         <w:rPr>
-          <w:rFonts w:ascii="Arial Unicode MS" w:eastAsia="Arial Unicode MS" w:hAnsi="Arial Unicode MS" w:cs="Arial Unicode MS"/>
-          <w:color w:val="202830"/>
-          <w:sz w:val="22"/>
-        </w:rPr>
-      </w:pPr>
-      <w:r>
-        <w:rPr>
-          <w:rFonts w:ascii="宋体" w:eastAsia="宋体" w:hAnsi="宋体" w:cs="宋体" w:hint="eastAsia"/>
-          <w:color w:val="202830"/>
-          <w:sz w:val="22"/>
+          <w:rFonts w:ascii="Arial" w:eastAsia="Microsoft YaHei" w:hAnsi="Arial" w:cs="Arial"/>
+          <w:color w:val="202830"/>
+          <w:sz w:val="22"/>
+        </w:rPr>
+      </w:pPr>
+      <w:r>
+        <w:rPr>
+          <w:rFonts w:ascii="Arial" w:eastAsia="Microsoft YaHei" w:hAnsi="Arial" w:cs="Arial"/>
+          <w:color w:val="202830"/>
+          <w:sz w:val="22"/>
+          <w:lang w:val="en-US" w:eastAsia="zh-CN" w:bidi="ar-SA"/>
         </w:rPr>
         <w:t>付款申请</w:t>
       </w:r>
@@ -291,34 +363,38 @@
     <w:p>
       <w:pPr>
         <w:rPr>
-          <w:rFonts w:ascii="Arial Unicode MS" w:eastAsia="Arial Unicode MS" w:hAnsi="Arial Unicode MS" w:cs="Arial Unicode MS"/>
-          <w:color w:val="202830"/>
-          <w:sz w:val="22"/>
-        </w:rPr>
-      </w:pPr>
-    </w:p>
-    <w:p>
-      <w:pPr>
-        <w:rPr>
-          <w:rFonts w:ascii="Arial Unicode MS" w:eastAsia="Arial Unicode MS" w:hAnsi="Arial Unicode MS" w:cs="Arial Unicode MS"/>
-          <w:color w:val="202830"/>
-          <w:sz w:val="22"/>
-        </w:rPr>
-      </w:pPr>
-    </w:p>
-    <w:p>
-      <w:pPr>
-        <w:rPr>
-          <w:rFonts w:ascii="Arial Unicode MS" w:eastAsia="Arial Unicode MS" w:hAnsi="Arial Unicode MS" w:cs="Arial Unicode MS" w:hint="eastAsia"/>
-          <w:color w:val="202830"/>
-          <w:sz w:val="22"/>
-        </w:rPr>
-      </w:pPr>
-      <w:r>
-        <w:rPr>
-          <w:rFonts w:ascii="宋体" w:eastAsia="宋体" w:hAnsi="宋体" w:cs="宋体" w:hint="eastAsia"/>
-          <w:color w:val="202830"/>
-          <w:sz w:val="22"/>
+          <w:rFonts w:ascii="Arial" w:eastAsia="Microsoft YaHei" w:hAnsi="Arial" w:cs="Arial"/>
+          <w:color w:val="202830"/>
+          <w:sz w:val="22"/>
+        </w:rPr>
+      </w:pPr>
+    </w:p>
+    <w:p>
+      <w:pPr>
+        <w:rPr>
+          <w:rFonts w:ascii="Arial" w:eastAsia="Microsoft YaHei" w:hAnsi="Arial" w:cs="Arial"/>
+          <w:color w:val="202830"/>
+          <w:sz w:val="22"/>
+        </w:rPr>
+      </w:pPr>
+    </w:p>
+    <w:p>
+      <w:pPr>
+        <w:pStyle w:val="1"/>
+        <w:keepNext/>
+        <w:keepLines/>
+        <w:rPr>
+          <w:rFonts w:ascii="Arial" w:eastAsia="Microsoft YaHei" w:hAnsi="Arial" w:cs="Arial"/>
+          <w:color w:val="202830"/>
+          <w:sz w:val="22"/>
+        </w:rPr>
+      </w:pPr>
+      <w:r>
+        <w:rPr>
+          <w:rFonts w:ascii="Arial" w:eastAsia="Microsoft YaHei" w:hAnsi="Arial" w:cs="Arial"/>
+          <w:color w:val="202830"/>
+          <w:sz w:val="22"/>
+          <w:lang w:val="en-US" w:eastAsia="zh-CN" w:bidi="ar-SA"/>
         </w:rPr>
         <w:t>财务：</w:t>
       </w:r>
@@ -326,16 +402,17 @@
     <w:p>
       <w:pPr>
         <w:rPr>
-          <w:rFonts w:ascii="Arial Unicode MS" w:eastAsia="Arial Unicode MS" w:hAnsi="Arial Unicode MS" w:cs="Arial Unicode MS"/>
-          <w:color w:val="202830"/>
-          <w:sz w:val="22"/>
-        </w:rPr>
-      </w:pPr>
-      <w:r>
-        <w:rPr>
-          <w:rFonts w:ascii="宋体" w:eastAsia="宋体" w:hAnsi="宋体" w:cs="宋体" w:hint="eastAsia"/>
-          <w:color w:val="202830"/>
-          <w:sz w:val="22"/>
+          <w:rFonts w:ascii="Arial" w:eastAsia="Microsoft YaHei" w:hAnsi="Arial" w:cs="Arial"/>
+          <w:color w:val="202830"/>
+          <w:sz w:val="22"/>
+        </w:rPr>
+      </w:pPr>
+      <w:r>
+        <w:rPr>
+          <w:rFonts w:ascii="Arial" w:eastAsia="Microsoft YaHei" w:hAnsi="Arial" w:cs="Arial"/>
+          <w:color w:val="202830"/>
+          <w:sz w:val="22"/>
+          <w:lang w:val="en-US" w:eastAsia="zh-CN" w:bidi="ar-SA"/>
         </w:rPr>
         <w:t>发票开具：根据发票申请单开具发票，开具日期，发票号码等关键信息记录。</w:t>
       </w:r>
@@ -343,32 +420,35 @@
     <w:p>
       <w:pPr>
         <w:rPr>
-          <w:rFonts w:ascii="Arial Unicode MS" w:eastAsia="Arial Unicode MS" w:hAnsi="Arial Unicode MS" w:cs="Arial Unicode MS"/>
-          <w:color w:val="202830"/>
-          <w:sz w:val="22"/>
-        </w:rPr>
-      </w:pPr>
-      <w:r>
-        <w:rPr>
-          <w:rFonts w:ascii="宋体" w:eastAsia="宋体" w:hAnsi="宋体" w:cs="宋体" w:hint="eastAsia"/>
-          <w:color w:val="202830"/>
-          <w:sz w:val="22"/>
+          <w:rFonts w:ascii="Arial" w:eastAsia="Microsoft YaHei" w:hAnsi="Arial" w:cs="Arial"/>
+          <w:color w:val="202830"/>
+          <w:sz w:val="22"/>
+        </w:rPr>
+      </w:pPr>
+      <w:r>
+        <w:rPr>
+          <w:rFonts w:ascii="Arial" w:eastAsia="Microsoft YaHei" w:hAnsi="Arial" w:cs="Arial"/>
+          <w:color w:val="202830"/>
+          <w:sz w:val="22"/>
+          <w:lang w:val="en-US" w:eastAsia="zh-CN" w:bidi="ar-SA"/>
         </w:rPr>
         <w:t>到款登记：</w:t>
       </w:r>
       <w:r>
         <w:rPr>
-          <w:rFonts w:ascii="宋体" w:eastAsia="宋体" w:hAnsi="宋体" w:cs="宋体" w:hint="eastAsia"/>
-          <w:color w:val="202830"/>
-          <w:sz w:val="22"/>
+          <w:rFonts w:ascii="Arial" w:eastAsia="Microsoft YaHei" w:hAnsi="Arial" w:cs="Arial"/>
+          <w:color w:val="202830"/>
+          <w:sz w:val="22"/>
+          <w:lang w:val="en-US" w:eastAsia="zh-CN" w:bidi="ar-SA"/>
         </w:rPr>
         <w:t>根据订单登记</w:t>
       </w:r>
       <w:r>
         <w:rPr>
-          <w:rFonts w:ascii="宋体" w:eastAsia="宋体" w:hAnsi="宋体" w:cs="宋体" w:hint="eastAsia"/>
-          <w:color w:val="202830"/>
-          <w:sz w:val="22"/>
+          <w:rFonts w:ascii="Arial" w:eastAsia="Microsoft YaHei" w:hAnsi="Arial" w:cs="Arial"/>
+          <w:color w:val="202830"/>
+          <w:sz w:val="22"/>
+          <w:lang w:val="en-US" w:eastAsia="zh-CN" w:bidi="ar-SA"/>
         </w:rPr>
         <w:t>到款日期、到款金额等关键信息记录，会有分次到款情况。</w:t>
       </w:r>
@@ -376,72 +456,80 @@
     <w:p>
       <w:pPr>
         <w:rPr>
-          <w:rFonts w:ascii="Arial Unicode MS" w:eastAsia="Arial Unicode MS" w:hAnsi="Arial Unicode MS" w:cs="Arial Unicode MS"/>
-          <w:color w:val="202830"/>
-          <w:sz w:val="22"/>
-        </w:rPr>
-      </w:pPr>
-      <w:r>
-        <w:rPr>
-          <w:rFonts w:ascii="宋体" w:eastAsia="宋体" w:hAnsi="宋体" w:cs="宋体" w:hint="eastAsia"/>
-          <w:color w:val="202830"/>
-          <w:sz w:val="22"/>
+          <w:rFonts w:ascii="Arial" w:eastAsia="Microsoft YaHei" w:hAnsi="Arial" w:cs="Arial"/>
+          <w:color w:val="202830"/>
+          <w:sz w:val="22"/>
+        </w:rPr>
+      </w:pPr>
+      <w:r>
+        <w:rPr>
+          <w:rFonts w:ascii="Arial" w:eastAsia="Microsoft YaHei" w:hAnsi="Arial" w:cs="Arial"/>
+          <w:color w:val="202830"/>
+          <w:sz w:val="22"/>
+          <w:lang w:val="en-US" w:eastAsia="zh-CN" w:bidi="ar-SA"/>
         </w:rPr>
         <w:t>付款登记：</w:t>
       </w:r>
       <w:r>
         <w:rPr>
-          <w:rFonts w:ascii="宋体" w:eastAsia="宋体" w:hAnsi="宋体" w:cs="宋体" w:hint="eastAsia"/>
-          <w:color w:val="202830"/>
-          <w:sz w:val="22"/>
+          <w:rFonts w:ascii="Arial" w:eastAsia="Microsoft YaHei" w:hAnsi="Arial" w:cs="Arial"/>
+          <w:color w:val="202830"/>
+          <w:sz w:val="22"/>
+          <w:lang w:val="en-US" w:eastAsia="zh-CN" w:bidi="ar-SA"/>
         </w:rPr>
         <w:t>根据订单登记</w:t>
       </w:r>
       <w:r>
         <w:rPr>
-          <w:rFonts w:ascii="宋体" w:eastAsia="宋体" w:hAnsi="宋体" w:cs="宋体" w:hint="eastAsia"/>
-          <w:color w:val="202830"/>
-          <w:sz w:val="22"/>
+          <w:rFonts w:ascii="Arial" w:eastAsia="Microsoft YaHei" w:hAnsi="Arial" w:cs="Arial"/>
+          <w:color w:val="202830"/>
+          <w:sz w:val="22"/>
+          <w:lang w:val="en-US" w:eastAsia="zh-CN" w:bidi="ar-SA"/>
         </w:rPr>
         <w:t>付款</w:t>
       </w:r>
       <w:r>
         <w:rPr>
-          <w:rFonts w:ascii="宋体" w:eastAsia="宋体" w:hAnsi="宋体" w:cs="宋体" w:hint="eastAsia"/>
-          <w:color w:val="202830"/>
-          <w:sz w:val="22"/>
+          <w:rFonts w:ascii="Arial" w:eastAsia="Microsoft YaHei" w:hAnsi="Arial" w:cs="Arial"/>
+          <w:color w:val="202830"/>
+          <w:sz w:val="22"/>
+          <w:lang w:val="en-US" w:eastAsia="zh-CN" w:bidi="ar-SA"/>
         </w:rPr>
         <w:t>日期、</w:t>
       </w:r>
       <w:r>
         <w:rPr>
-          <w:rFonts w:ascii="宋体" w:eastAsia="宋体" w:hAnsi="宋体" w:cs="宋体" w:hint="eastAsia"/>
-          <w:color w:val="202830"/>
-          <w:sz w:val="22"/>
+          <w:rFonts w:ascii="Arial" w:eastAsia="Microsoft YaHei" w:hAnsi="Arial" w:cs="Arial"/>
+          <w:color w:val="202830"/>
+          <w:sz w:val="22"/>
+          <w:lang w:val="en-US" w:eastAsia="zh-CN" w:bidi="ar-SA"/>
         </w:rPr>
         <w:t>付</w:t>
       </w:r>
       <w:r>
         <w:rPr>
-          <w:rFonts w:ascii="宋体" w:eastAsia="宋体" w:hAnsi="宋体" w:cs="宋体" w:hint="eastAsia"/>
-          <w:color w:val="202830"/>
-          <w:sz w:val="22"/>
+          <w:rFonts w:ascii="Arial" w:eastAsia="Microsoft YaHei" w:hAnsi="Arial" w:cs="Arial"/>
+          <w:color w:val="202830"/>
+          <w:sz w:val="22"/>
+          <w:lang w:val="en-US" w:eastAsia="zh-CN" w:bidi="ar-SA"/>
         </w:rPr>
         <w:t>款金额等关键信息记录，会有分次</w:t>
       </w:r>
       <w:r>
         <w:rPr>
-          <w:rFonts w:ascii="宋体" w:eastAsia="宋体" w:hAnsi="宋体" w:cs="宋体" w:hint="eastAsia"/>
-          <w:color w:val="202830"/>
-          <w:sz w:val="22"/>
+          <w:rFonts w:ascii="Arial" w:eastAsia="Microsoft YaHei" w:hAnsi="Arial" w:cs="Arial"/>
+          <w:color w:val="202830"/>
+          <w:sz w:val="22"/>
+          <w:lang w:val="en-US" w:eastAsia="zh-CN" w:bidi="ar-SA"/>
         </w:rPr>
         <w:t>付</w:t>
       </w:r>
       <w:r>
         <w:rPr>
-          <w:rFonts w:ascii="宋体" w:eastAsia="宋体" w:hAnsi="宋体" w:cs="宋体" w:hint="eastAsia"/>
-          <w:color w:val="202830"/>
-          <w:sz w:val="22"/>
+          <w:rFonts w:ascii="Arial" w:eastAsia="Microsoft YaHei" w:hAnsi="Arial" w:cs="Arial"/>
+          <w:color w:val="202830"/>
+          <w:sz w:val="22"/>
+          <w:lang w:val="en-US" w:eastAsia="zh-CN" w:bidi="ar-SA"/>
         </w:rPr>
         <w:t>款情况。</w:t>
       </w:r>
@@ -449,9 +537,15 @@
     <w:p/>
     <w:p/>
     <w:p>
-      <w:r>
-        <w:rPr>
-          <w:rFonts w:hint="eastAsia"/>
+      <w:pPr>
+        <w:pStyle w:val="1"/>
+        <w:keepNext/>
+        <w:keepLines/>
+      </w:pPr>
+      <w:r>
+        <w:rPr>
+          <w:rFonts w:ascii="Arial" w:hAnsi="Arial" w:eastAsia="Microsoft YaHei" w:cs="Arial"/>
+          <w:lang w:val="en-US" w:eastAsia="zh-CN" w:bidi="ar-SA"/>
         </w:rPr>
         <w:t>工单系统</w:t>
       </w:r>
@@ -460,20 +554,22 @@
       <w:pPr>
         <w:ind w:firstLine="420"/>
         <w:rPr>
-          <w:rFonts w:ascii="Arial Unicode MS" w:hAnsi="Arial Unicode MS" w:cs="Arial Unicode MS"/>
-          <w:color w:val="202830"/>
-        </w:rPr>
-      </w:pPr>
-      <w:r>
-        <w:rPr>
-          <w:rFonts w:hint="eastAsia"/>
+          <w:rFonts w:ascii="Arial" w:hAnsi="Arial" w:cs="Arial" w:eastAsia="Microsoft YaHei"/>
+          <w:color w:val="202830"/>
+        </w:rPr>
+      </w:pPr>
+      <w:r>
+        <w:rPr>
+          <w:rFonts w:ascii="Arial" w:hAnsi="Arial" w:eastAsia="Microsoft YaHei" w:cs="Arial"/>
+          <w:lang w:val="en-US" w:eastAsia="zh-CN" w:bidi="ar-SA"/>
         </w:rPr>
         <w:t>售后技术支持记录，</w:t>
       </w:r>
       <w:r>
         <w:rPr>
-          <w:rFonts w:ascii="Arial Unicode MS" w:eastAsia="Arial Unicode MS" w:hAnsi="Arial Unicode MS" w:cs="Arial Unicode MS"/>
-          <w:color w:val="202830"/>
+          <w:rFonts w:ascii="Arial" w:eastAsia="Microsoft YaHei" w:hAnsi="Arial" w:cs="Arial"/>
+          <w:color w:val="202830"/>
+          <w:lang w:val="en-US" w:eastAsia="zh-CN" w:bidi="ar-SA"/>
         </w:rPr>
         <w:t>形成工单，关联原订单、合同、产品、批次、设备和保修。</w:t>
       </w:r>
@@ -481,30 +577,34 @@
     <w:p>
       <w:pPr>
         <w:rPr>
-          <w:rFonts w:ascii="Arial Unicode MS" w:hAnsi="Arial Unicode MS" w:cs="Arial Unicode MS" w:hint="eastAsia"/>
-          <w:color w:val="202830"/>
-        </w:rPr>
-      </w:pPr>
-    </w:p>
-    <w:p>
-      <w:pPr>
-        <w:rPr>
-          <w:rFonts w:ascii="Arial Unicode MS" w:hAnsi="Arial Unicode MS" w:cs="Arial Unicode MS"/>
-          <w:color w:val="202830"/>
-        </w:rPr>
-      </w:pPr>
-    </w:p>
-    <w:p>
-      <w:pPr>
-        <w:rPr>
-          <w:rFonts w:ascii="Arial Unicode MS" w:hAnsi="Arial Unicode MS" w:cs="Arial Unicode MS"/>
-          <w:color w:val="202830"/>
-        </w:rPr>
-      </w:pPr>
-      <w:r>
-        <w:rPr>
-          <w:rFonts w:ascii="Arial Unicode MS" w:hAnsi="Arial Unicode MS" w:cs="Arial Unicode MS" w:hint="eastAsia"/>
-          <w:color w:val="202830"/>
+          <w:rFonts w:ascii="Arial" w:hAnsi="Arial" w:cs="Arial" w:eastAsia="Microsoft YaHei"/>
+          <w:color w:val="202830"/>
+        </w:rPr>
+      </w:pPr>
+    </w:p>
+    <w:p>
+      <w:pPr>
+        <w:rPr>
+          <w:rFonts w:ascii="Arial" w:hAnsi="Arial" w:cs="Arial" w:eastAsia="Microsoft YaHei"/>
+          <w:color w:val="202830"/>
+        </w:rPr>
+      </w:pPr>
+    </w:p>
+    <w:p>
+      <w:pPr>
+        <w:pStyle w:val="1"/>
+        <w:keepNext/>
+        <w:keepLines/>
+        <w:rPr>
+          <w:rFonts w:ascii="Arial" w:hAnsi="Arial" w:cs="Arial" w:eastAsia="Microsoft YaHei"/>
+          <w:color w:val="202830"/>
+        </w:rPr>
+      </w:pPr>
+      <w:r>
+        <w:rPr>
+          <w:rFonts w:ascii="Arial" w:hAnsi="Arial" w:cs="Arial" w:eastAsia="Microsoft YaHei"/>
+          <w:color w:val="202830"/>
+          <w:lang w:val="en-US" w:eastAsia="zh-CN" w:bidi="ar-SA"/>
         </w:rPr>
         <w:t>管理</w:t>
       </w:r>
@@ -513,42 +613,47 @@
       <w:pPr>
         <w:ind w:firstLineChars="200" w:firstLine="420"/>
         <w:rPr>
-          <w:rFonts w:ascii="Arial Unicode MS" w:hAnsi="Arial Unicode MS" w:cs="Arial Unicode MS"/>
-          <w:color w:val="202830"/>
-        </w:rPr>
-      </w:pPr>
-      <w:r>
-        <w:rPr>
-          <w:rFonts w:ascii="Arial Unicode MS" w:eastAsia="Arial Unicode MS" w:hAnsi="Arial Unicode MS" w:cs="Arial Unicode MS"/>
-          <w:color w:val="202830"/>
+          <w:rFonts w:ascii="Arial" w:hAnsi="Arial" w:cs="Arial" w:eastAsia="Microsoft YaHei"/>
+          <w:color w:val="202830"/>
+        </w:rPr>
+      </w:pPr>
+      <w:r>
+        <w:rPr>
+          <w:rFonts w:ascii="Arial" w:eastAsia="Microsoft YaHei" w:hAnsi="Arial" w:cs="Arial"/>
+          <w:color w:val="202830"/>
+          <w:lang w:val="en-US" w:eastAsia="zh-CN" w:bidi="ar-SA"/>
         </w:rPr>
         <w:t>管理层</w:t>
       </w:r>
       <w:r>
         <w:rPr>
-          <w:rFonts w:ascii="宋体" w:eastAsia="宋体" w:hAnsi="宋体" w:cs="宋体" w:hint="eastAsia"/>
-          <w:color w:val="202830"/>
+          <w:rFonts w:ascii="Arial" w:eastAsia="Microsoft YaHei" w:hAnsi="Arial" w:cs="Arial"/>
+          <w:color w:val="202830"/>
+          <w:lang w:val="en-US" w:eastAsia="zh-CN" w:bidi="ar-SA"/>
         </w:rPr>
         <w:t>对合同和发票申请进行审批，可</w:t>
       </w:r>
       <w:r>
         <w:rPr>
-          <w:rFonts w:ascii="Arial Unicode MS" w:eastAsia="Arial Unicode MS" w:hAnsi="Arial Unicode MS" w:cs="Arial Unicode MS"/>
-          <w:color w:val="202830"/>
+          <w:rFonts w:ascii="Arial" w:eastAsia="Microsoft YaHei" w:hAnsi="Arial" w:cs="Arial"/>
+          <w:color w:val="202830"/>
+          <w:lang w:val="en-US" w:eastAsia="zh-CN" w:bidi="ar-SA"/>
         </w:rPr>
         <w:t>随时查看收入、成本、交付、利润</w:t>
       </w:r>
       <w:r>
         <w:rPr>
-          <w:rFonts w:ascii="宋体" w:eastAsia="宋体" w:hAnsi="宋体" w:cs="宋体" w:hint="eastAsia"/>
-          <w:color w:val="202830"/>
+          <w:rFonts w:ascii="Arial" w:eastAsia="Microsoft YaHei" w:hAnsi="Arial" w:cs="Arial"/>
+          <w:color w:val="202830"/>
+          <w:lang w:val="en-US" w:eastAsia="zh-CN" w:bidi="ar-SA"/>
         </w:rPr>
         <w:t>等</w:t>
       </w:r>
       <w:r>
         <w:rPr>
-          <w:rFonts w:ascii="Arial Unicode MS" w:eastAsia="Arial Unicode MS" w:hAnsi="Arial Unicode MS" w:cs="Arial Unicode MS"/>
-          <w:color w:val="202830"/>
+          <w:rFonts w:ascii="Arial" w:eastAsia="Microsoft YaHei" w:hAnsi="Arial" w:cs="Arial"/>
+          <w:color w:val="202830"/>
+          <w:lang w:val="en-US" w:eastAsia="zh-CN" w:bidi="ar-SA"/>
         </w:rPr>
         <w:t>。</w:t>
       </w:r>
@@ -556,22 +661,24 @@
     <w:p>
       <w:pPr>
         <w:rPr>
-          <w:rFonts w:ascii="Arial Unicode MS" w:hAnsi="Arial Unicode MS" w:cs="Arial Unicode MS"/>
-          <w:color w:val="202830"/>
-        </w:rPr>
-      </w:pPr>
-    </w:p>
-    <w:p>
-      <w:pPr>
-        <w:rPr>
-          <w:rFonts w:ascii="Arial Unicode MS" w:hAnsi="Arial Unicode MS" w:cs="Arial Unicode MS"/>
-          <w:color w:val="202830"/>
-        </w:rPr>
-      </w:pPr>
-    </w:p>
-    <w:p>
-      <w:pPr>
-        <w:pStyle w:val="2"/>
+          <w:rFonts w:ascii="Arial" w:hAnsi="Arial" w:cs="Arial" w:eastAsia="Microsoft YaHei"/>
+          <w:color w:val="202830"/>
+        </w:rPr>
+      </w:pPr>
+    </w:p>
+    <w:p>
+      <w:pPr>
+        <w:rPr>
+          <w:rFonts w:ascii="Arial" w:hAnsi="Arial" w:cs="Arial" w:eastAsia="Microsoft YaHei"/>
+          <w:color w:val="202830"/>
+        </w:rPr>
+      </w:pPr>
+    </w:p>
+    <w:p>
+      <w:pPr>
+        <w:pStyle w:val="1"/>
+        <w:keepNext/>
+        <w:keepLines/>
         <w:rPr>
           <w:sz w:val="21"/>
           <w:szCs w:val="21"/>
@@ -579,11 +686,12 @@
       </w:pPr>
       <w:r>
         <w:rPr>
-          <w:rFonts w:ascii="Arial Unicode MS" w:eastAsia="Arial Unicode MS" w:hAnsi="Arial Unicode MS" w:cs="Arial Unicode MS"/>
+          <w:rFonts w:ascii="Arial" w:eastAsia="Microsoft YaHei" w:hAnsi="Arial" w:cs="Arial"/>
           <w:b/>
           <w:color w:val="2E74B5"/>
           <w:sz w:val="21"/>
           <w:szCs w:val="21"/>
+          <w:lang w:val="en-US" w:eastAsia="zh-CN" w:bidi="ar-SA"/>
         </w:rPr>
         <w:t>合同管理</w:t>
       </w:r>
@@ -591,9 +699,10 @@
     <w:p>
       <w:r>
         <w:rPr>
-          <w:rFonts w:ascii="Arial Unicode MS" w:eastAsia="Arial Unicode MS" w:hAnsi="Arial Unicode MS" w:cs="Arial Unicode MS"/>
-          <w:color w:val="202830"/>
-          <w:sz w:val="22"/>
+          <w:rFonts w:ascii="Arial" w:eastAsia="Microsoft YaHei" w:hAnsi="Arial" w:cs="Arial"/>
+          <w:color w:val="202830"/>
+          <w:sz w:val="22"/>
+          <w:lang w:val="en-US" w:eastAsia="zh-CN" w:bidi="ar-SA"/>
         </w:rPr>
         <w:t>重点把合同的三类信息管清楚：关键条款、收付款信息、合同附件。</w:t>
       </w:r>
@@ -606,13 +715,13 @@
           <w:numId w:val="3"/>
         </w:numPr>
         <w:rPr>
-          <w:lang w:eastAsia="zh-CN"/>
-        </w:rPr>
-      </w:pPr>
-      <w:r>
-        <w:rPr>
-          <w:rFonts w:ascii="宋体" w:eastAsia="宋体" w:hAnsi="宋体" w:cs="宋体"/>
-          <w:lang w:eastAsia="zh-CN"/>
+          <w:lang w:eastAsia="zh-CN" w:val="en-US" w:bidi="ar-SA"/>
+        </w:rPr>
+      </w:pPr>
+      <w:r>
+        <w:rPr>
+          <w:rFonts w:ascii="Arial" w:eastAsia="Microsoft YaHei" w:hAnsi="Arial" w:cs="Arial"/>
+          <w:lang w:eastAsia="zh-CN" w:val="en-US" w:bidi="ar-SA"/>
         </w:rPr>
         <w:t>支持模板、版本、批注、审批、签章、印章、履约、续签和到期提醒。</w:t>
       </w:r>
@@ -628,17 +737,19 @@
       </w:pPr>
       <w:r>
         <w:rPr>
-          <w:rFonts w:ascii="宋体" w:eastAsia="宋体" w:hAnsi="宋体" w:cs="宋体" w:hint="eastAsia"/>
-          <w:color w:val="202830"/>
-          <w:sz w:val="22"/>
+          <w:rFonts w:ascii="Arial" w:eastAsia="Microsoft YaHei" w:hAnsi="Arial" w:cs="Arial"/>
+          <w:color w:val="202830"/>
+          <w:sz w:val="22"/>
+          <w:lang w:val="en-US" w:eastAsia="zh-CN" w:bidi="ar-SA"/>
         </w:rPr>
         <w:t>合</w:t>
       </w:r>
       <w:r>
         <w:rPr>
-          <w:rFonts w:ascii="Arial Unicode MS" w:eastAsia="Arial Unicode MS" w:hAnsi="Arial Unicode MS" w:cs="Arial Unicode MS"/>
-          <w:color w:val="202830"/>
-          <w:sz w:val="22"/>
+          <w:rFonts w:ascii="Arial" w:eastAsia="Microsoft YaHei" w:hAnsi="Arial" w:cs="Arial"/>
+          <w:color w:val="202830"/>
+          <w:sz w:val="22"/>
+          <w:lang w:val="en-US" w:eastAsia="zh-CN" w:bidi="ar-SA"/>
         </w:rPr>
         <w:t>同审批后，可自动生成订单、采购需求、项目任务、收款计划和交付节点。</w:t>
       </w:r>
@@ -654,9 +765,10 @@
       </w:pPr>
       <w:r>
         <w:rPr>
-          <w:rFonts w:ascii="Arial Unicode MS" w:hAnsi="Arial Unicode MS" w:cs="Arial Unicode MS" w:hint="eastAsia"/>
-          <w:color w:val="202830"/>
-          <w:sz w:val="22"/>
+          <w:rFonts w:ascii="Arial" w:hAnsi="Arial" w:cs="Arial" w:eastAsia="Microsoft YaHei"/>
+          <w:color w:val="202830"/>
+          <w:sz w:val="22"/>
+          <w:lang w:val="en-US" w:eastAsia="zh-CN" w:bidi="ar-SA"/>
         </w:rPr>
         <w:t>合同可进行合并。</w:t>
       </w:r>
@@ -668,13 +780,15 @@
         <w:ind w:left="270"/>
         <w:jc w:val="left"/>
         <w:rPr>
-          <w:rFonts w:hint="eastAsia"/>
-        </w:rPr>
-      </w:pPr>
-    </w:p>
-    <w:p>
-      <w:pPr>
-        <w:pStyle w:val="2"/>
+          <w:rFonts w:ascii="Arial" w:hAnsi="Arial" w:eastAsia="Microsoft YaHei" w:cs="Arial"/>
+        </w:rPr>
+      </w:pPr>
+    </w:p>
+    <w:p>
+      <w:pPr>
+        <w:pStyle w:val="1"/>
+        <w:keepNext/>
+        <w:keepLines/>
         <w:rPr>
           <w:sz w:val="21"/>
           <w:szCs w:val="21"/>
@@ -682,11 +796,12 @@
       </w:pPr>
       <w:r>
         <w:rPr>
-          <w:rFonts w:ascii="Arial Unicode MS" w:eastAsia="Arial Unicode MS" w:hAnsi="Arial Unicode MS" w:cs="Arial Unicode MS"/>
+          <w:rFonts w:ascii="Arial" w:eastAsia="Microsoft YaHei" w:hAnsi="Arial" w:cs="Arial"/>
           <w:b/>
           <w:color w:val="2E74B5"/>
           <w:sz w:val="21"/>
           <w:szCs w:val="21"/>
+          <w:lang w:val="en-US" w:eastAsia="zh-CN" w:bidi="ar-SA"/>
         </w:rPr>
         <w:t>订单管理</w:t>
       </w:r>
@@ -694,9 +809,10 @@
     <w:p>
       <w:r>
         <w:rPr>
-          <w:rFonts w:ascii="Arial Unicode MS" w:eastAsia="Arial Unicode MS" w:hAnsi="Arial Unicode MS" w:cs="Arial Unicode MS"/>
-          <w:color w:val="202830"/>
-          <w:sz w:val="22"/>
+          <w:rFonts w:ascii="Arial" w:eastAsia="Microsoft YaHei" w:hAnsi="Arial" w:cs="Arial"/>
+          <w:color w:val="202830"/>
+          <w:sz w:val="22"/>
+          <w:lang w:val="en-US" w:eastAsia="zh-CN" w:bidi="ar-SA"/>
         </w:rPr>
         <w:t>销售下单后，系统自动检查价格权限、合同、库存、交期和客户信用。</w:t>
       </w:r>
@@ -709,13 +825,13 @@
           <w:numId w:val="4"/>
         </w:numPr>
         <w:rPr>
-          <w:lang w:eastAsia="zh-CN"/>
-        </w:rPr>
-      </w:pPr>
-      <w:r>
-        <w:rPr>
-          <w:rFonts w:ascii="宋体" w:eastAsia="宋体" w:hAnsi="宋体" w:cs="宋体"/>
-          <w:lang w:eastAsia="zh-CN"/>
+          <w:lang w:eastAsia="zh-CN" w:val="en-US" w:bidi="ar-SA"/>
+        </w:rPr>
+      </w:pPr>
+      <w:r>
+        <w:rPr>
+          <w:rFonts w:ascii="Arial" w:eastAsia="Microsoft YaHei" w:hAnsi="Arial" w:cs="Arial"/>
+          <w:lang w:eastAsia="zh-CN" w:val="en-US" w:bidi="ar-SA"/>
         </w:rPr>
         <w:t>支持订单变更、分批交付、退货、换货、直运、寄售、订阅和租赁。</w:t>
       </w:r>
@@ -731,18 +847,20 @@
       </w:pPr>
       <w:r>
         <w:rPr>
-          <w:rFonts w:ascii="宋体" w:eastAsia="宋体" w:hAnsi="宋体" w:cs="宋体" w:hint="eastAsia"/>
-          <w:color w:val="202830"/>
-          <w:sz w:val="22"/>
+          <w:rFonts w:ascii="Arial" w:eastAsia="Microsoft YaHei" w:hAnsi="Arial" w:cs="Arial"/>
+          <w:color w:val="202830"/>
+          <w:sz w:val="22"/>
+          <w:lang w:val="en-US" w:eastAsia="zh-CN" w:bidi="ar-SA"/>
         </w:rPr>
         <w:lastRenderedPageBreak/>
         <w:t>每</w:t>
       </w:r>
       <w:r>
         <w:rPr>
-          <w:rFonts w:ascii="Arial Unicode MS" w:eastAsia="Arial Unicode MS" w:hAnsi="Arial Unicode MS" w:cs="Arial Unicode MS"/>
-          <w:color w:val="202830"/>
-          <w:sz w:val="22"/>
+          <w:rFonts w:ascii="Arial" w:eastAsia="Microsoft YaHei" w:hAnsi="Arial" w:cs="Arial"/>
+          <w:color w:val="202830"/>
+          <w:sz w:val="22"/>
+          <w:lang w:val="en-US" w:eastAsia="zh-CN" w:bidi="ar-SA"/>
         </w:rPr>
         <w:t>次变更都保留版本和审批记录，避免口头修改造成部门信息不一致。</w:t>
       </w:r>
@@ -750,14 +868,16 @@
     <w:p>
       <w:pPr>
         <w:rPr>
-          <w:rFonts w:ascii="Arial Unicode MS" w:hAnsi="Arial Unicode MS" w:cs="Arial Unicode MS"/>
-          <w:color w:val="202830"/>
-        </w:rPr>
-      </w:pPr>
-    </w:p>
-    <w:p>
-      <w:pPr>
-        <w:pStyle w:val="2"/>
+          <w:rFonts w:ascii="Arial" w:hAnsi="Arial" w:cs="Arial" w:eastAsia="Microsoft YaHei"/>
+          <w:color w:val="202830"/>
+        </w:rPr>
+      </w:pPr>
+    </w:p>
+    <w:p>
+      <w:pPr>
+        <w:pStyle w:val="1"/>
+        <w:keepNext/>
+        <w:keepLines/>
         <w:rPr>
           <w:sz w:val="21"/>
           <w:szCs w:val="21"/>
@@ -765,11 +885,12 @@
       </w:pPr>
       <w:r>
         <w:rPr>
-          <w:rFonts w:ascii="Arial Unicode MS" w:eastAsia="Arial Unicode MS" w:hAnsi="Arial Unicode MS" w:cs="Arial Unicode MS"/>
+          <w:rFonts w:ascii="Arial" w:eastAsia="Microsoft YaHei" w:hAnsi="Arial" w:cs="Arial"/>
           <w:b/>
           <w:color w:val="2E74B5"/>
           <w:sz w:val="21"/>
           <w:szCs w:val="21"/>
+          <w:lang w:val="en-US" w:eastAsia="zh-CN" w:bidi="ar-SA"/>
         </w:rPr>
         <w:t>采购与供应商</w:t>
       </w:r>
@@ -777,9 +898,10 @@
     <w:p>
       <w:r>
         <w:rPr>
-          <w:rFonts w:ascii="Arial Unicode MS" w:eastAsia="Arial Unicode MS" w:hAnsi="Arial Unicode MS" w:cs="Arial Unicode MS"/>
-          <w:color w:val="202830"/>
-          <w:sz w:val="22"/>
+          <w:rFonts w:ascii="Arial" w:eastAsia="Microsoft YaHei" w:hAnsi="Arial" w:cs="Arial"/>
+          <w:color w:val="202830"/>
+          <w:sz w:val="22"/>
+          <w:lang w:val="en-US" w:eastAsia="zh-CN" w:bidi="ar-SA"/>
         </w:rPr>
         <w:t>订单、生产、项目或库存不足都可以自动形成采购建议。</w:t>
       </w:r>
@@ -792,13 +914,13 @@
           <w:numId w:val="5"/>
         </w:numPr>
         <w:rPr>
-          <w:lang w:eastAsia="zh-CN"/>
-        </w:rPr>
-      </w:pPr>
-      <w:r>
-        <w:rPr>
-          <w:rFonts w:ascii="宋体" w:eastAsia="宋体" w:hAnsi="宋体" w:cs="宋体"/>
-          <w:lang w:eastAsia="zh-CN"/>
+          <w:lang w:eastAsia="zh-CN" w:val="en-US" w:bidi="ar-SA"/>
+        </w:rPr>
+      </w:pPr>
+      <w:r>
+        <w:rPr>
+          <w:rFonts w:ascii="Arial" w:eastAsia="Microsoft YaHei" w:hAnsi="Arial" w:cs="Arial"/>
+          <w:lang w:eastAsia="zh-CN" w:val="en-US" w:bidi="ar-SA"/>
         </w:rPr>
         <w:t>覆盖合同、订单、收货、退货、发票和付款。</w:t>
       </w:r>
@@ -814,17 +936,19 @@
       </w:pPr>
       <w:r>
         <w:rPr>
-          <w:rFonts w:ascii="宋体" w:eastAsia="宋体" w:hAnsi="宋体" w:cs="宋体" w:hint="eastAsia"/>
-          <w:color w:val="202830"/>
-          <w:sz w:val="22"/>
+          <w:rFonts w:ascii="Arial" w:eastAsia="Microsoft YaHei" w:hAnsi="Arial" w:cs="Arial"/>
+          <w:color w:val="202830"/>
+          <w:sz w:val="22"/>
+          <w:lang w:val="en-US" w:eastAsia="zh-CN" w:bidi="ar-SA"/>
         </w:rPr>
         <w:t>记</w:t>
       </w:r>
       <w:r>
         <w:rPr>
-          <w:rFonts w:ascii="Arial Unicode MS" w:eastAsia="Arial Unicode MS" w:hAnsi="Arial Unicode MS" w:cs="Arial Unicode MS"/>
-          <w:color w:val="202830"/>
-          <w:sz w:val="22"/>
+          <w:rFonts w:ascii="Arial" w:eastAsia="Microsoft YaHei" w:hAnsi="Arial" w:cs="Arial"/>
+          <w:color w:val="202830"/>
+          <w:sz w:val="22"/>
+          <w:lang w:val="en-US" w:eastAsia="zh-CN" w:bidi="ar-SA"/>
         </w:rPr>
         <w:t>录供应商资质、价格、交期、质量和风险；供应商也可通过门户协同。</w:t>
       </w:r>
@@ -832,22 +956,26 @@
     <w:p>
       <w:pPr>
         <w:rPr>
-          <w:rFonts w:ascii="Arial Unicode MS" w:hAnsi="Arial Unicode MS" w:cs="Arial Unicode MS" w:hint="eastAsia"/>
-          <w:color w:val="202830"/>
-        </w:rPr>
-      </w:pPr>
-    </w:p>
-    <w:p>
-      <w:pPr>
-        <w:rPr>
-          <w:rFonts w:ascii="Arial Unicode MS" w:hAnsi="Arial Unicode MS" w:cs="Arial Unicode MS"/>
-          <w:color w:val="202830"/>
-        </w:rPr>
-      </w:pPr>
-      <w:r>
-        <w:rPr>
-          <w:rFonts w:ascii="Arial Unicode MS" w:hAnsi="Arial Unicode MS" w:cs="Arial Unicode MS" w:hint="eastAsia"/>
-          <w:color w:val="202830"/>
+          <w:rFonts w:ascii="Arial" w:hAnsi="Arial" w:cs="Arial" w:eastAsia="Microsoft YaHei"/>
+          <w:color w:val="202830"/>
+        </w:rPr>
+      </w:pPr>
+    </w:p>
+    <w:p>
+      <w:pPr>
+        <w:pStyle w:val="1"/>
+        <w:keepNext/>
+        <w:keepLines/>
+        <w:rPr>
+          <w:rFonts w:ascii="Arial" w:hAnsi="Arial" w:cs="Arial" w:eastAsia="Microsoft YaHei"/>
+          <w:color w:val="202830"/>
+        </w:rPr>
+      </w:pPr>
+      <w:r>
+        <w:rPr>
+          <w:rFonts w:ascii="Arial" w:hAnsi="Arial" w:cs="Arial" w:eastAsia="Microsoft YaHei"/>
+          <w:color w:val="202830"/>
+          <w:lang w:val="en-US" w:eastAsia="zh-CN" w:bidi="ar-SA"/>
         </w:rPr>
         <w:t>报表</w:t>
       </w:r>
@@ -855,39 +983,39 @@
     <w:p>
       <w:pPr>
         <w:rPr>
-          <w:rFonts w:ascii="Arial Unicode MS" w:hAnsi="Arial Unicode MS" w:cs="Arial Unicode MS"/>
-          <w:color w:val="202830"/>
-        </w:rPr>
-      </w:pPr>
-    </w:p>
-    <w:p>
-      <w:pPr>
-        <w:rPr>
-          <w:rFonts w:ascii="Arial Unicode MS" w:hAnsi="Arial Unicode MS" w:cs="Arial Unicode MS"/>
-          <w:color w:val="202830"/>
-        </w:rPr>
-      </w:pPr>
-    </w:p>
-    <w:p>
-      <w:pPr>
-        <w:rPr>
-          <w:rFonts w:ascii="Arial Unicode MS" w:hAnsi="Arial Unicode MS" w:cs="Arial Unicode MS"/>
-          <w:color w:val="202830"/>
-        </w:rPr>
-      </w:pPr>
-    </w:p>
-    <w:p>
-      <w:pPr>
-        <w:rPr>
-          <w:rFonts w:ascii="Arial Unicode MS" w:hAnsi="Arial Unicode MS" w:cs="Arial Unicode MS"/>
-          <w:color w:val="202830"/>
-        </w:rPr>
-      </w:pPr>
-    </w:p>
-    <w:p>
-      <w:pPr>
-        <w:rPr>
-          <w:rFonts w:ascii="Arial Unicode MS" w:hAnsi="Arial Unicode MS" w:cs="Arial Unicode MS"/>
+          <w:rFonts w:ascii="Arial" w:hAnsi="Arial" w:cs="Arial" w:eastAsia="Microsoft YaHei"/>
+          <w:color w:val="202830"/>
+        </w:rPr>
+      </w:pPr>
+    </w:p>
+    <w:p>
+      <w:pPr>
+        <w:rPr>
+          <w:rFonts w:ascii="Arial" w:hAnsi="Arial" w:cs="Arial" w:eastAsia="Microsoft YaHei"/>
+          <w:color w:val="202830"/>
+        </w:rPr>
+      </w:pPr>
+    </w:p>
+    <w:p>
+      <w:pPr>
+        <w:rPr>
+          <w:rFonts w:ascii="Arial" w:hAnsi="Arial" w:cs="Arial" w:eastAsia="Microsoft YaHei"/>
+          <w:color w:val="202830"/>
+        </w:rPr>
+      </w:pPr>
+    </w:p>
+    <w:p>
+      <w:pPr>
+        <w:rPr>
+          <w:rFonts w:ascii="Arial" w:hAnsi="Arial" w:cs="Arial" w:eastAsia="Microsoft YaHei"/>
+          <w:color w:val="202830"/>
+        </w:rPr>
+      </w:pPr>
+    </w:p>
+    <w:p>
+      <w:pPr>
+        <w:rPr>
+          <w:rFonts w:ascii="Arial" w:hAnsi="Arial" w:cs="Arial" w:eastAsia="Microsoft YaHei"/>
           <w:color w:val="202830"/>
         </w:rPr>
       </w:pPr>
@@ -895,13 +1023,16 @@
     <w:p>
       <w:pPr>
         <w:pStyle w:val="1"/>
-      </w:pPr>
-      <w:r>
-        <w:rPr>
-          <w:rFonts w:ascii="Arial Unicode MS" w:eastAsia="Arial Unicode MS" w:hAnsi="Arial Unicode MS" w:cs="Arial Unicode MS"/>
+        <w:keepNext/>
+        <w:keepLines/>
+      </w:pPr>
+      <w:r>
+        <w:rPr>
+          <w:rFonts w:ascii="Arial" w:eastAsia="Microsoft YaHei" w:hAnsi="Arial" w:cs="Arial"/>
           <w:b/>
           <w:color w:val="2E74B5"/>
           <w:sz w:val="32"/>
+          <w:lang w:val="en-US" w:eastAsia="zh-CN" w:bidi="ar-SA"/>
         </w:rPr>
         <w:t>高度定制，但不破坏升级</w:t>
       </w:r>
@@ -915,21 +1046,21 @@
         </w:numPr>
         <w:spacing w:after="40" w:line="276" w:lineRule="auto"/>
         <w:rPr>
-          <w:lang w:eastAsia="zh-CN"/>
-        </w:rPr>
-      </w:pPr>
-      <w:r>
-        <w:rPr>
-          <w:rFonts w:ascii="宋体" w:eastAsia="宋体" w:hAnsi="宋体" w:cs="宋体"/>
+          <w:lang w:eastAsia="zh-CN" w:val="en-US" w:bidi="ar-SA"/>
+        </w:rPr>
+      </w:pPr>
+      <w:r>
+        <w:rPr>
+          <w:rFonts w:ascii="Arial" w:eastAsia="Microsoft YaHei" w:hAnsi="Arial" w:cs="Arial"/>
           <w:b/>
-          <w:lang w:eastAsia="zh-CN"/>
+          <w:lang w:eastAsia="zh-CN" w:val="en-US" w:bidi="ar-SA"/>
         </w:rPr>
         <w:t>数据可定制：</w:t>
       </w:r>
       <w:r>
         <w:rPr>
-          <w:rFonts w:ascii="宋体" w:eastAsia="宋体" w:hAnsi="宋体" w:cs="宋体"/>
-          <w:lang w:eastAsia="zh-CN"/>
+          <w:rFonts w:ascii="Arial" w:eastAsia="Microsoft YaHei" w:hAnsi="Arial" w:cs="Arial"/>
+          <w:lang w:eastAsia="zh-CN" w:val="en-US" w:bidi="ar-SA"/>
         </w:rPr>
         <w:t>新增业务对象、字段、关系、编号、校验、视图和搜索。</w:t>
       </w:r>
@@ -946,40 +1077,45 @@
       </w:pPr>
       <w:r>
         <w:rPr>
-          <w:rFonts w:ascii="宋体" w:eastAsia="宋体" w:hAnsi="宋体" w:cs="宋体" w:hint="eastAsia"/>
+          <w:rFonts w:ascii="Arial" w:eastAsia="Microsoft YaHei" w:hAnsi="Arial" w:cs="Arial"/>
           <w:b/>
           <w:color w:val="202830"/>
+          <w:lang w:val="en-US" w:eastAsia="zh-CN" w:bidi="ar-SA"/>
         </w:rPr>
         <w:t>界</w:t>
       </w:r>
       <w:r>
         <w:rPr>
-          <w:rFonts w:ascii="Arial Unicode MS" w:eastAsia="Arial Unicode MS" w:hAnsi="Arial Unicode MS" w:cs="Arial Unicode MS"/>
+          <w:rFonts w:ascii="Arial" w:eastAsia="Microsoft YaHei" w:hAnsi="Arial" w:cs="Arial"/>
           <w:b/>
           <w:color w:val="202830"/>
+          <w:lang w:val="en-US" w:eastAsia="zh-CN" w:bidi="ar-SA"/>
         </w:rPr>
         <w:t>面可定制：</w:t>
       </w:r>
       <w:r>
         <w:rPr>
-          <w:rFonts w:ascii="Arial Unicode MS" w:eastAsia="Arial Unicode MS" w:hAnsi="Arial Unicode MS" w:cs="Arial Unicode MS"/>
-          <w:color w:val="202830"/>
+          <w:rFonts w:ascii="Arial" w:eastAsia="Microsoft YaHei" w:hAnsi="Arial" w:cs="Arial"/>
+          <w:color w:val="202830"/>
+          <w:lang w:val="en-US" w:eastAsia="zh-CN" w:bidi="ar-SA"/>
         </w:rPr>
         <w:t>调整表单、列表、首页、菜单、看板和移动</w:t>
       </w:r>
       <w:proofErr w:type="gramStart"/>
       <w:r>
         <w:rPr>
-          <w:rFonts w:ascii="Arial Unicode MS" w:eastAsia="Arial Unicode MS" w:hAnsi="Arial Unicode MS" w:cs="Arial Unicode MS"/>
-          <w:color w:val="202830"/>
+          <w:rFonts w:ascii="Arial" w:eastAsia="Microsoft YaHei" w:hAnsi="Arial" w:cs="Arial"/>
+          <w:color w:val="202830"/>
+          <w:lang w:val="en-US" w:eastAsia="zh-CN" w:bidi="ar-SA"/>
         </w:rPr>
         <w:t>端任务</w:t>
       </w:r>
       <w:proofErr w:type="gramEnd"/>
       <w:r>
         <w:rPr>
-          <w:rFonts w:ascii="Arial Unicode MS" w:eastAsia="Arial Unicode MS" w:hAnsi="Arial Unicode MS" w:cs="Arial Unicode MS"/>
-          <w:color w:val="202830"/>
+          <w:rFonts w:ascii="Arial" w:eastAsia="Microsoft YaHei" w:hAnsi="Arial" w:cs="Arial"/>
+          <w:color w:val="202830"/>
+          <w:lang w:val="en-US" w:eastAsia="zh-CN" w:bidi="ar-SA"/>
         </w:rPr>
         <w:t>页面。</w:t>
       </w:r>
@@ -996,16 +1132,18 @@
       </w:pPr>
       <w:r>
         <w:rPr>
-          <w:rFonts w:ascii="Arial Unicode MS" w:eastAsia="Arial Unicode MS" w:hAnsi="Arial Unicode MS" w:cs="Arial Unicode MS"/>
+          <w:rFonts w:ascii="Arial" w:eastAsia="Microsoft YaHei" w:hAnsi="Arial" w:cs="Arial"/>
           <w:b/>
           <w:color w:val="202830"/>
+          <w:lang w:val="en-US" w:eastAsia="zh-CN" w:bidi="ar-SA"/>
         </w:rPr>
         <w:t>流程可定制：</w:t>
       </w:r>
       <w:r>
         <w:rPr>
-          <w:rFonts w:ascii="Arial Unicode MS" w:eastAsia="Arial Unicode MS" w:hAnsi="Arial Unicode MS" w:cs="Arial Unicode MS"/>
-          <w:color w:val="202830"/>
+          <w:rFonts w:ascii="Arial" w:eastAsia="Microsoft YaHei" w:hAnsi="Arial" w:cs="Arial"/>
+          <w:color w:val="202830"/>
+          <w:lang w:val="en-US" w:eastAsia="zh-CN" w:bidi="ar-SA"/>
         </w:rPr>
         <w:t>设置审批、会签、时限、提醒、升级、自动任务和跨部门动作。</w:t>
       </w:r>
@@ -1022,16 +1160,18 @@
       </w:pPr>
       <w:r>
         <w:rPr>
-          <w:rFonts w:ascii="Arial Unicode MS" w:eastAsia="Arial Unicode MS" w:hAnsi="Arial Unicode MS" w:cs="Arial Unicode MS"/>
+          <w:rFonts w:ascii="Arial" w:eastAsia="Microsoft YaHei" w:hAnsi="Arial" w:cs="Arial"/>
           <w:b/>
           <w:color w:val="202830"/>
+          <w:lang w:val="en-US" w:eastAsia="zh-CN" w:bidi="ar-SA"/>
         </w:rPr>
         <w:t>权限可定制：</w:t>
       </w:r>
       <w:r>
         <w:rPr>
-          <w:rFonts w:ascii="Arial Unicode MS" w:eastAsia="Arial Unicode MS" w:hAnsi="Arial Unicode MS" w:cs="Arial Unicode MS"/>
-          <w:color w:val="202830"/>
+          <w:rFonts w:ascii="Arial" w:eastAsia="Microsoft YaHei" w:hAnsi="Arial" w:cs="Arial"/>
+          <w:color w:val="202830"/>
+          <w:lang w:val="en-US" w:eastAsia="zh-CN" w:bidi="ar-SA"/>
         </w:rPr>
         <w:t>按法人、部门、岗位、项目、客户、记录和字段控制访问。</w:t>
       </w:r>
@@ -1048,16 +1188,18 @@
       </w:pPr>
       <w:r>
         <w:rPr>
-          <w:rFonts w:ascii="Arial Unicode MS" w:eastAsia="Arial Unicode MS" w:hAnsi="Arial Unicode MS" w:cs="Arial Unicode MS"/>
+          <w:rFonts w:ascii="Arial" w:eastAsia="Microsoft YaHei" w:hAnsi="Arial" w:cs="Arial"/>
           <w:b/>
           <w:color w:val="202830"/>
+          <w:lang w:val="en-US" w:eastAsia="zh-CN" w:bidi="ar-SA"/>
         </w:rPr>
         <w:t>报表可定制：</w:t>
       </w:r>
       <w:r>
         <w:rPr>
-          <w:rFonts w:ascii="Arial Unicode MS" w:eastAsia="Arial Unicode MS" w:hAnsi="Arial Unicode MS" w:cs="Arial Unicode MS"/>
-          <w:color w:val="202830"/>
+          <w:rFonts w:ascii="Arial" w:eastAsia="Microsoft YaHei" w:hAnsi="Arial" w:cs="Arial"/>
+          <w:color w:val="202830"/>
+          <w:lang w:val="en-US" w:eastAsia="zh-CN" w:bidi="ar-SA"/>
         </w:rPr>
         <w:t>建立企业自己的指标、报表、打印模板和管理驾驶舱。</w:t>
       </w:r>
@@ -1074,16 +1216,18 @@
       </w:pPr>
       <w:r>
         <w:rPr>
-          <w:rFonts w:ascii="Arial Unicode MS" w:eastAsia="Arial Unicode MS" w:hAnsi="Arial Unicode MS" w:cs="Arial Unicode MS"/>
+          <w:rFonts w:ascii="Arial" w:eastAsia="Microsoft YaHei" w:hAnsi="Arial" w:cs="Arial"/>
           <w:b/>
           <w:color w:val="202830"/>
+          <w:lang w:val="en-US" w:eastAsia="zh-CN" w:bidi="ar-SA"/>
         </w:rPr>
         <w:t>品牌可定制：</w:t>
       </w:r>
       <w:r>
         <w:rPr>
-          <w:rFonts w:ascii="Arial Unicode MS" w:eastAsia="Arial Unicode MS" w:hAnsi="Arial Unicode MS" w:cs="Arial Unicode MS"/>
-          <w:color w:val="202830"/>
+          <w:rFonts w:ascii="Arial" w:eastAsia="Microsoft YaHei" w:hAnsi="Arial" w:cs="Arial"/>
+          <w:color w:val="202830"/>
+          <w:lang w:val="en-US" w:eastAsia="zh-CN" w:bidi="ar-SA"/>
         </w:rPr>
         <w:t>每个客户可使用自己的名称、图标、颜色和客户端包。</w:t>
       </w:r>
@@ -1100,16 +1244,18 @@
       </w:pPr>
       <w:r>
         <w:rPr>
-          <w:rFonts w:ascii="Arial Unicode MS" w:eastAsia="Arial Unicode MS" w:hAnsi="Arial Unicode MS" w:cs="Arial Unicode MS"/>
+          <w:rFonts w:ascii="Arial" w:eastAsia="Microsoft YaHei" w:hAnsi="Arial" w:cs="Arial"/>
           <w:b/>
           <w:color w:val="202830"/>
+          <w:lang w:val="en-US" w:eastAsia="zh-CN" w:bidi="ar-SA"/>
         </w:rPr>
         <w:t>扩展可安装：</w:t>
       </w:r>
       <w:r>
         <w:rPr>
-          <w:rFonts w:ascii="Arial Unicode MS" w:eastAsia="Arial Unicode MS" w:hAnsi="Arial Unicode MS" w:cs="Arial Unicode MS"/>
-          <w:color w:val="202830"/>
+          <w:rFonts w:ascii="Arial" w:eastAsia="Microsoft YaHei" w:hAnsi="Arial" w:cs="Arial"/>
+          <w:color w:val="202830"/>
+          <w:lang w:val="en-US" w:eastAsia="zh-CN" w:bidi="ar-SA"/>
         </w:rPr>
         <w:t>通过签名模块或受控插件增加特殊能力；配置先验证审批，出现问题可回退。</w:t>
       </w:r>
@@ -1117,7 +1263,7 @@
     <w:p>
       <w:pPr>
         <w:rPr>
-          <w:rFonts w:hint="eastAsia"/>
+          <w:rFonts w:ascii="Arial" w:hAnsi="Arial" w:eastAsia="Microsoft YaHei" w:cs="Arial"/>
         </w:rPr>
       </w:pPr>
     </w:p>
@@ -1151,7 +1297,7 @@
         <w:ind w:left="540" w:hanging="270"/>
       </w:pPr>
       <w:rPr>
-        <w:rFonts w:ascii="Arial Unicode MS" w:eastAsia="Arial Unicode MS" w:hAnsi="Arial Unicode MS"/>
+        <w:rFonts w:ascii="Arial" w:eastAsia="Microsoft YaHei" w:hAnsi="Arial" w:cs="Arial"/>
       </w:rPr>
     </w:lvl>
   </w:abstractNum>
@@ -1168,7 +1314,7 @@
         <w:ind w:left="570" w:hanging="360"/>
       </w:pPr>
       <w:rPr>
-        <w:rFonts w:hint="default"/>
+        <w:rFonts w:ascii="Arial" w:hAnsi="Arial" w:eastAsia="Microsoft YaHei" w:cs="Arial"/>
       </w:rPr>
     </w:lvl>
     <w:lvl w:ilvl="1" w:tplc="04090019" w:tentative="1">
@@ -1257,7 +1403,7 @@
         <w:ind w:left="570" w:hanging="360"/>
       </w:pPr>
       <w:rPr>
-        <w:rFonts w:hint="default"/>
+        <w:rFonts w:ascii="Arial" w:hAnsi="Arial" w:eastAsia="Microsoft YaHei" w:cs="Arial"/>
       </w:rPr>
     </w:lvl>
     <w:lvl w:ilvl="1" w:tplc="04090019" w:tentative="1">
@@ -1374,7 +1520,7 @@
   <w:docDefaults>
     <w:rPrDefault>
       <w:rPr>
-        <w:rFonts w:asciiTheme="minorHAnsi" w:eastAsiaTheme="minorEastAsia" w:hAnsiTheme="minorHAnsi" w:cstheme="minorBidi"/>
+        <w:rFonts w:ascii="Arial" w:hAnsi="Arial" w:eastAsia="Microsoft YaHei" w:cs="Arial"/>
         <w:kern w:val="2"/>
         <w:sz w:val="21"/>
         <w:szCs w:val="22"/>
@@ -1768,6 +1914,10 @@
       <w:widowControl w:val="0"/>
       <w:jc w:val="both"/>
     </w:pPr>
+    <w:rPr>
+      <w:rFonts w:ascii="Arial" w:hAnsi="Arial" w:eastAsia="Microsoft YaHei" w:cs="Arial"/>
+      <w:lang w:val="en-US" w:eastAsia="zh-CN" w:bidi="ar-SA"/>
+    </w:rPr>
   </w:style>
   <w:style w:type="paragraph" w:styleId="1">
     <w:name w:val="heading 1"/>
@@ -1784,10 +1934,11 @@
       <w:outlineLvl w:val="0"/>
     </w:pPr>
     <w:rPr>
-      <w:rFonts w:asciiTheme="majorHAnsi" w:eastAsiaTheme="majorEastAsia" w:hAnsiTheme="majorHAnsi" w:cstheme="majorBidi"/>
+      <w:rFonts w:ascii="Arial" w:hAnsi="Arial" w:eastAsia="Microsoft YaHei" w:cs="Arial"/>
       <w:color w:val="0F4761" w:themeColor="accent1" w:themeShade="BF"/>
       <w:sz w:val="48"/>
       <w:szCs w:val="48"/>
+      <w:lang w:val="en-US" w:eastAsia="zh-CN" w:bidi="ar-SA"/>
     </w:rPr>
   </w:style>
   <w:style w:type="paragraph" w:styleId="2">
@@ -1806,10 +1957,11 @@
       <w:outlineLvl w:val="1"/>
     </w:pPr>
     <w:rPr>
-      <w:rFonts w:asciiTheme="majorHAnsi" w:eastAsiaTheme="majorEastAsia" w:hAnsiTheme="majorHAnsi" w:cstheme="majorBidi"/>
+      <w:rFonts w:ascii="Arial" w:hAnsi="Arial" w:eastAsia="Microsoft YaHei" w:cs="Arial"/>
       <w:color w:val="0F4761" w:themeColor="accent1" w:themeShade="BF"/>
       <w:sz w:val="40"/>
       <w:szCs w:val="40"/>
+      <w:lang w:val="en-US" w:eastAsia="zh-CN" w:bidi="ar-SA"/>
     </w:rPr>
   </w:style>
   <w:style w:type="paragraph" w:styleId="3">
@@ -1829,10 +1981,11 @@
       <w:outlineLvl w:val="2"/>
     </w:pPr>
     <w:rPr>
-      <w:rFonts w:asciiTheme="majorHAnsi" w:eastAsiaTheme="majorEastAsia" w:hAnsiTheme="majorHAnsi" w:cstheme="majorBidi"/>
+      <w:rFonts w:ascii="Arial" w:hAnsi="Arial" w:eastAsia="Microsoft YaHei" w:cs="Arial"/>
       <w:color w:val="0F4761" w:themeColor="accent1" w:themeShade="BF"/>
       <w:sz w:val="32"/>
       <w:szCs w:val="32"/>
+      <w:lang w:val="en-US" w:eastAsia="zh-CN" w:bidi="ar-SA"/>
     </w:rPr>
   </w:style>
   <w:style w:type="paragraph" w:styleId="4">
@@ -1852,7 +2005,7 @@
       <w:outlineLvl w:val="3"/>
     </w:pPr>
     <w:rPr>
-      <w:rFonts w:cstheme="majorBidi"/>
+      <w:rFonts w:ascii="Arial" w:hAnsi="Arial" w:eastAsia="Microsoft YaHei" w:cs="Arial"/>
       <w:color w:val="0F4761" w:themeColor="accent1" w:themeShade="BF"/>
       <w:sz w:val="28"/>
       <w:szCs w:val="28"/>
@@ -1875,7 +2028,7 @@
       <w:outlineLvl w:val="4"/>
     </w:pPr>
     <w:rPr>
-      <w:rFonts w:cstheme="majorBidi"/>
+      <w:rFonts w:ascii="Arial" w:hAnsi="Arial" w:eastAsia="Microsoft YaHei" w:cs="Arial"/>
       <w:color w:val="0F4761" w:themeColor="accent1" w:themeShade="BF"/>
       <w:sz w:val="24"/>
       <w:szCs w:val="24"/>
@@ -1898,7 +2051,7 @@
       <w:outlineLvl w:val="5"/>
     </w:pPr>
     <w:rPr>
-      <w:rFonts w:cstheme="majorBidi"/>
+      <w:rFonts w:ascii="Arial" w:hAnsi="Arial" w:eastAsia="Microsoft YaHei" w:cs="Arial"/>
       <w:b/>
       <w:bCs/>
       <w:color w:val="0F4761" w:themeColor="accent1" w:themeShade="BF"/>
@@ -1921,7 +2074,7 @@
       <w:outlineLvl w:val="6"/>
     </w:pPr>
     <w:rPr>
-      <w:rFonts w:cstheme="majorBidi"/>
+      <w:rFonts w:ascii="Arial" w:hAnsi="Arial" w:eastAsia="Microsoft YaHei" w:cs="Arial"/>
       <w:b/>
       <w:bCs/>
       <w:color w:val="595959" w:themeColor="text1" w:themeTint="A6"/>
@@ -1943,7 +2096,7 @@
       <w:outlineLvl w:val="7"/>
     </w:pPr>
     <w:rPr>
-      <w:rFonts w:cstheme="majorBidi"/>
+      <w:rFonts w:ascii="Arial" w:hAnsi="Arial" w:eastAsia="Microsoft YaHei" w:cs="Arial"/>
       <w:color w:val="595959" w:themeColor="text1" w:themeTint="A6"/>
     </w:rPr>
   </w:style>
@@ -1963,7 +2116,7 @@
       <w:outlineLvl w:val="8"/>
     </w:pPr>
     <w:rPr>
-      <w:rFonts w:eastAsiaTheme="majorEastAsia" w:cstheme="majorBidi"/>
+      <w:rFonts w:ascii="Arial" w:hAnsi="Arial" w:eastAsia="Microsoft YaHei" w:cs="Arial"/>
       <w:color w:val="595959" w:themeColor="text1" w:themeTint="A6"/>
     </w:rPr>
   </w:style>
@@ -2001,7 +2154,7 @@
     <w:uiPriority w:val="9"/>
     <w:rsid w:val="00972D65"/>
     <w:rPr>
-      <w:rFonts w:asciiTheme="majorHAnsi" w:eastAsiaTheme="majorEastAsia" w:hAnsiTheme="majorHAnsi" w:cstheme="majorBidi"/>
+      <w:rFonts w:ascii="Arial" w:hAnsi="Arial" w:eastAsia="Microsoft YaHei" w:cs="Arial"/>
       <w:color w:val="0F4761" w:themeColor="accent1" w:themeShade="BF"/>
       <w:sz w:val="48"/>
       <w:szCs w:val="48"/>
@@ -2014,7 +2167,7 @@
     <w:uiPriority w:val="9"/>
     <w:rsid w:val="00972D65"/>
     <w:rPr>
-      <w:rFonts w:asciiTheme="majorHAnsi" w:eastAsiaTheme="majorEastAsia" w:hAnsiTheme="majorHAnsi" w:cstheme="majorBidi"/>
+      <w:rFonts w:ascii="Arial" w:hAnsi="Arial" w:eastAsia="Microsoft YaHei" w:cs="Arial"/>
       <w:color w:val="0F4761" w:themeColor="accent1" w:themeShade="BF"/>
       <w:sz w:val="40"/>
       <w:szCs w:val="40"/>
@@ -2028,7 +2181,7 @@
     <w:semiHidden/>
     <w:rsid w:val="00972D65"/>
     <w:rPr>
-      <w:rFonts w:asciiTheme="majorHAnsi" w:eastAsiaTheme="majorEastAsia" w:hAnsiTheme="majorHAnsi" w:cstheme="majorBidi"/>
+      <w:rFonts w:ascii="Arial" w:hAnsi="Arial" w:eastAsia="Microsoft YaHei" w:cs="Arial"/>
       <w:color w:val="0F4761" w:themeColor="accent1" w:themeShade="BF"/>
       <w:sz w:val="32"/>
       <w:szCs w:val="32"/>
@@ -2042,7 +2195,7 @@
     <w:semiHidden/>
     <w:rsid w:val="00972D65"/>
     <w:rPr>
-      <w:rFonts w:cstheme="majorBidi"/>
+      <w:rFonts w:ascii="Arial" w:hAnsi="Arial" w:eastAsia="Microsoft YaHei" w:cs="Arial"/>
       <w:color w:val="0F4761" w:themeColor="accent1" w:themeShade="BF"/>
       <w:sz w:val="28"/>
       <w:szCs w:val="28"/>
@@ -2056,7 +2209,7 @@
     <w:semiHidden/>
     <w:rsid w:val="00972D65"/>
     <w:rPr>
-      <w:rFonts w:cstheme="majorBidi"/>
+      <w:rFonts w:ascii="Arial" w:hAnsi="Arial" w:eastAsia="Microsoft YaHei" w:cs="Arial"/>
       <w:color w:val="0F4761" w:themeColor="accent1" w:themeShade="BF"/>
       <w:sz w:val="24"/>
       <w:szCs w:val="24"/>
@@ -2070,7 +2223,7 @@
     <w:semiHidden/>
     <w:rsid w:val="00972D65"/>
     <w:rPr>
-      <w:rFonts w:cstheme="majorBidi"/>
+      <w:rFonts w:ascii="Arial" w:hAnsi="Arial" w:eastAsia="Microsoft YaHei" w:cs="Arial"/>
       <w:b/>
       <w:bCs/>
       <w:color w:val="0F4761" w:themeColor="accent1" w:themeShade="BF"/>
@@ -2084,7 +2237,7 @@
     <w:semiHidden/>
     <w:rsid w:val="00972D65"/>
     <w:rPr>
-      <w:rFonts w:cstheme="majorBidi"/>
+      <w:rFonts w:ascii="Arial" w:hAnsi="Arial" w:eastAsia="Microsoft YaHei" w:cs="Arial"/>
       <w:b/>
       <w:bCs/>
       <w:color w:val="595959" w:themeColor="text1" w:themeTint="A6"/>
@@ -2098,7 +2251,7 @@
     <w:semiHidden/>
     <w:rsid w:val="00972D65"/>
     <w:rPr>
-      <w:rFonts w:cstheme="majorBidi"/>
+      <w:rFonts w:ascii="Arial" w:hAnsi="Arial" w:eastAsia="Microsoft YaHei" w:cs="Arial"/>
       <w:color w:val="595959" w:themeColor="text1" w:themeTint="A6"/>
     </w:rPr>
   </w:style>
@@ -2110,7 +2263,7 @@
     <w:semiHidden/>
     <w:rsid w:val="00972D65"/>
     <w:rPr>
-      <w:rFonts w:eastAsiaTheme="majorEastAsia" w:cstheme="majorBidi"/>
+      <w:rFonts w:ascii="Arial" w:hAnsi="Arial" w:eastAsia="Microsoft YaHei" w:cs="Arial"/>
       <w:color w:val="595959" w:themeColor="text1" w:themeTint="A6"/>
     </w:rPr>
   </w:style>
@@ -2128,7 +2281,7 @@
       <w:jc w:val="center"/>
     </w:pPr>
     <w:rPr>
-      <w:rFonts w:asciiTheme="majorHAnsi" w:eastAsiaTheme="majorEastAsia" w:hAnsiTheme="majorHAnsi" w:cstheme="majorBidi"/>
+      <w:rFonts w:ascii="Arial" w:hAnsi="Arial" w:eastAsia="Microsoft YaHei" w:cs="Arial"/>
       <w:spacing w:val="-10"/>
       <w:kern w:val="28"/>
       <w:sz w:val="56"/>
@@ -2142,7 +2295,7 @@
     <w:uiPriority w:val="10"/>
     <w:rsid w:val="00972D65"/>
     <w:rPr>
-      <w:rFonts w:asciiTheme="majorHAnsi" w:eastAsiaTheme="majorEastAsia" w:hAnsiTheme="majorHAnsi" w:cstheme="majorBidi"/>
+      <w:rFonts w:ascii="Arial" w:hAnsi="Arial" w:eastAsia="Microsoft YaHei" w:cs="Arial"/>
       <w:spacing w:val="-10"/>
       <w:kern w:val="28"/>
       <w:sz w:val="56"/>
@@ -2165,7 +2318,7 @@
       <w:jc w:val="center"/>
     </w:pPr>
     <w:rPr>
-      <w:rFonts w:asciiTheme="majorHAnsi" w:eastAsiaTheme="majorEastAsia" w:hAnsiTheme="majorHAnsi" w:cstheme="majorBidi"/>
+      <w:rFonts w:ascii="Arial" w:hAnsi="Arial" w:eastAsia="Microsoft YaHei" w:cs="Arial"/>
       <w:color w:val="595959" w:themeColor="text1" w:themeTint="A6"/>
       <w:spacing w:val="15"/>
       <w:sz w:val="28"/>
@@ -2179,7 +2332,7 @@
     <w:uiPriority w:val="11"/>
     <w:rsid w:val="00972D65"/>
     <w:rPr>
-      <w:rFonts w:asciiTheme="majorHAnsi" w:eastAsiaTheme="majorEastAsia" w:hAnsiTheme="majorHAnsi" w:cstheme="majorBidi"/>
+      <w:rFonts w:ascii="Arial" w:hAnsi="Arial" w:eastAsia="Microsoft YaHei" w:cs="Arial"/>
       <w:color w:val="595959" w:themeColor="text1" w:themeTint="A6"/>
       <w:spacing w:val="15"/>
       <w:sz w:val="28"/>
@@ -2308,11 +2461,11 @@
       <w:jc w:val="left"/>
     </w:pPr>
     <w:rPr>
-      <w:rFonts w:ascii="Arial Unicode MS" w:eastAsia="Arial Unicode MS" w:hAnsi="Arial Unicode MS" w:cs="Arial Unicode MS"/>
+      <w:rFonts w:ascii="Arial" w:eastAsia="Microsoft YaHei" w:hAnsi="Arial" w:cs="Arial"/>
       <w:color w:val="202830"/>
       <w:kern w:val="0"/>
       <w:sz w:val="22"/>
-      <w:lang w:eastAsia="en-US"/>
+      <w:lang w:eastAsia="zh-CN" w:val="en-US" w:bidi="ar-SA"/>
     </w:rPr>
   </w:style>
 </w:styles>

</xml_diff>